<commit_message>
0.0.6.6 - Batch 6.6 - Fix expedition bugs and update documentation
- Fixed expedition stuck in returningToCamp when provisions depleted.
- Fixed expedition gathering on camp instead of assigned area.
- Updated Bibbia (GDD).md with Consumption and Provisions section.
- Updated TECHNICAL.md with GameConfig and Debug Panel sections.
- Updated Prototipo 1.md with Batch 6.6 refinements.
</commit_message>
<xml_diff>
--- a/Docs/Bibbia (GDD).docx
+++ b/Docs/Bibbia (GDD).docx
@@ -3350,6 +3350,200 @@
     </w:p>
     <w:p>
       <w:pPr>
+        <w:pStyle w:val="Heading2"/>
+      </w:pPr>
+      <w:r>
+        <w:t>Consumo e provviste</w:t>
+      </w:r>
+    </w:p>
+    <w:p>
+      <w:pPr>
+        <w:rPr>
+          <w:lang w:val="it-IT"/>
+        </w:rPr>
+      </w:pPr>
+      <w:r>
+        <w:rPr>
+          <w:lang w:val="it-IT"/>
+        </w:rPr>
+        <w:t>Il cibo è l'unica risorsa vitale nel prototipo. Il consumo della popolazione si divide in base al contesto:</w:t>
+      </w:r>
+    </w:p>
+    <w:p>
+      <w:pPr>
+        <w:pStyle w:val="ListParagraph"/>
+        <w:numPr>
+          <w:ilvl w:val="0"/>
+          <w:numId w:val="35"/>
+        </w:numPr>
+        <w:rPr>
+          <w:lang w:val="it-IT"/>
+        </w:rPr>
+      </w:pPr>
+      <w:r>
+        <w:rPr>
+          <w:lang w:val="it-IT"/>
+        </w:rPr>
+        <w:t>Popolazione al campo: consuma una razione giornaliera fissa, calcolata per l'intera tribù a fine giornata.</w:t>
+      </w:r>
+    </w:p>
+    <w:p>
+      <w:pPr>
+        <w:rPr>
+          <w:lang w:val="it-IT"/>
+        </w:rPr>
+      </w:pPr>
+    </w:p>
+    <w:p>
+      <w:pPr>
+        <w:pStyle w:val="ListParagraph"/>
+        <w:numPr>
+          <w:ilvl w:val="0"/>
+          <w:numId w:val="35"/>
+        </w:numPr>
+        <w:rPr>
+          <w:lang w:val="it-IT"/>
+        </w:rPr>
+      </w:pPr>
+      <w:r>
+        <w:rPr>
+          <w:lang w:val="it-IT"/>
+        </w:rPr>
+        <w:lastRenderedPageBreak/>
+        <w:t>Spedizioni in viaggio: consumano provviste in modo continuo, proporzionalmente al tempo trascorso e con un moltiplicatore maggiore rispetto al riposo (perché camminare stanca di più).</w:t>
+      </w:r>
+    </w:p>
+    <w:p>
+      <w:pPr>
+        <w:pStyle w:val="ListParagraph"/>
+        <w:numPr>
+          <w:ilvl w:val="0"/>
+          <w:numId w:val="35"/>
+        </w:numPr>
+        <w:rPr>
+          <w:lang w:val="it-IT"/>
+        </w:rPr>
+      </w:pPr>
+      <w:r>
+        <w:rPr>
+          <w:lang w:val="it-IT"/>
+        </w:rPr>
+        <w:t>Spedizioni durante la raccolta: consumano ancora di più, perché lo sforzo fisico è superiore.</w:t>
+      </w:r>
+    </w:p>
+    <w:p>
+      <w:pPr>
+        <w:rPr>
+          <w:lang w:val="it-IT"/>
+        </w:rPr>
+      </w:pPr>
+      <w:r>
+        <w:rPr>
+          <w:lang w:val="it-IT"/>
+        </w:rPr>
+        <w:t>Le provviste assegnate a una spedizione non sono un numero fisso, ma vengono calcolate alla partenza e a ogni ripartenza. Il calcolo considera:</w:t>
+      </w:r>
+    </w:p>
+    <w:p>
+      <w:pPr>
+        <w:pStyle w:val="ListParagraph"/>
+        <w:numPr>
+          <w:ilvl w:val="0"/>
+          <w:numId w:val="35"/>
+        </w:numPr>
+        <w:rPr>
+          <w:lang w:val="it-IT"/>
+        </w:rPr>
+      </w:pPr>
+      <w:r>
+        <w:rPr>
+          <w:lang w:val="it-IT"/>
+        </w:rPr>
+        <w:t>La distanza da percorrere (andata e ritorno).</w:t>
+      </w:r>
+    </w:p>
+    <w:p>
+      <w:pPr>
+        <w:pStyle w:val="ListParagraph"/>
+        <w:numPr>
+          <w:ilvl w:val="0"/>
+          <w:numId w:val="35"/>
+        </w:numPr>
+        <w:rPr>
+          <w:lang w:val="it-IT"/>
+        </w:rPr>
+      </w:pPr>
+      <w:r>
+        <w:rPr>
+          <w:lang w:val="it-IT"/>
+        </w:rPr>
+        <w:t>La velocità di spostamento della spedizione.</w:t>
+      </w:r>
+    </w:p>
+    <w:p>
+      <w:pPr>
+        <w:pStyle w:val="ListParagraph"/>
+        <w:numPr>
+          <w:ilvl w:val="0"/>
+          <w:numId w:val="35"/>
+        </w:numPr>
+        <w:rPr>
+          <w:lang w:val="it-IT"/>
+        </w:rPr>
+      </w:pPr>
+      <w:r>
+        <w:rPr>
+          <w:lang w:val="it-IT"/>
+        </w:rPr>
+        <w:t>Il numero di lavoratori.</w:t>
+      </w:r>
+    </w:p>
+    <w:p>
+      <w:pPr>
+        <w:pStyle w:val="ListParagraph"/>
+        <w:numPr>
+          <w:ilvl w:val="0"/>
+          <w:numId w:val="35"/>
+        </w:numPr>
+        <w:rPr>
+          <w:lang w:val="it-IT"/>
+        </w:rPr>
+      </w:pPr>
+      <w:r>
+        <w:rPr>
+          <w:lang w:val="it-IT"/>
+        </w:rPr>
+        <w:t>Un margine di sicurezza che include il tempo di raccolta e gli imprevisti.</w:t>
+      </w:r>
+    </w:p>
+    <w:p>
+      <w:pPr>
+        <w:rPr>
+          <w:lang w:val="it-IT"/>
+        </w:rPr>
+      </w:pPr>
+      <w:r>
+        <w:rPr>
+          <w:lang w:val="it-IT"/>
+        </w:rPr>
+        <w:t>Il limite principale è la capacità di carico: se le provviste calcolate superano la capacità massima, la spedizione parte con meno provviste e tornerà prima.</w:t>
+      </w:r>
+    </w:p>
+    <w:p>
+      <w:pPr>
+        <w:rPr>
+          <w:lang w:val="it-IT"/>
+        </w:rPr>
+      </w:pPr>
+      <w:r>
+        <w:rPr>
+          <w:lang w:val="it-IT"/>
+        </w:rPr>
+        <w:t>Dopo una spedizione, i lavoratori devono riposare. Il tempo di riposo è proporzionale alla durata della spedizione appena conclusa (una percentuale configurabile). Questa regola collega lo sforzo al recupero: spedizioni lunghe richiedono riposi più lunghi.</w:t>
+      </w:r>
+    </w:p>
+    <w:p>
+      <w:pPr>
         <w:pStyle w:val="Heading1"/>
       </w:pPr>
       <w:proofErr w:type="spellStart"/>
@@ -3432,7 +3626,6 @@
       </w:pPr>
       <w:proofErr w:type="spellStart"/>
       <w:r>
-        <w:lastRenderedPageBreak/>
         <w:t>Fedeltà</w:t>
       </w:r>
       <w:proofErr w:type="spellEnd"/>
@@ -3604,6 +3797,7 @@
         <w:pStyle w:val="Heading1"/>
       </w:pPr>
       <w:r>
+        <w:lastRenderedPageBreak/>
         <w:t xml:space="preserve">Governo e </w:t>
       </w:r>
       <w:proofErr w:type="spellStart"/>
@@ -3836,112 +4030,250 @@
       </w:pPr>
       <w:proofErr w:type="spellStart"/>
       <w:r>
+        <w:t>Informazione</w:t>
+      </w:r>
+      <w:proofErr w:type="spellEnd"/>
+      <w:r>
+        <w:t xml:space="preserve"> e UI</w:t>
+      </w:r>
+    </w:p>
+    <w:p>
+      <w:pPr>
+        <w:numPr>
+          <w:ilvl w:val="0"/>
+          <w:numId w:val="30"/>
+        </w:numPr>
+        <w:rPr>
+          <w:lang w:val="it-IT"/>
+        </w:rPr>
+      </w:pPr>
+      <w:r>
+        <w:rPr>
+          <w:b/>
+          <w:bCs/>
+          <w:lang w:val="it-IT"/>
+        </w:rPr>
+        <w:t>Visibilità:</w:t>
+      </w:r>
+      <w:r>
+        <w:rPr>
+          <w:lang w:val="it-IT"/>
+        </w:rPr>
+        <w:t> tre stati (certa, da report, proiettata) per ogni entità sulla mappa.</w:t>
+      </w:r>
+    </w:p>
+    <w:p>
+      <w:pPr>
+        <w:numPr>
+          <w:ilvl w:val="0"/>
+          <w:numId w:val="30"/>
+        </w:numPr>
+        <w:rPr>
+          <w:lang w:val="it-IT"/>
+        </w:rPr>
+      </w:pPr>
+      <w:r>
+        <w:rPr>
+          <w:b/>
+          <w:bCs/>
+          <w:lang w:val="it-IT"/>
+        </w:rPr>
+        <w:t>Gestione dei report:</w:t>
+      </w:r>
+      <w:r>
+        <w:rPr>
+          <w:lang w:val="it-IT"/>
+        </w:rPr>
+        <w:t> ritardi e imprecisioni dipendono dalla distanza e dall'affidabilità della fonte.</w:t>
+      </w:r>
+    </w:p>
+    <w:p>
+      <w:pPr>
+        <w:numPr>
+          <w:ilvl w:val="0"/>
+          <w:numId w:val="30"/>
+        </w:numPr>
+        <w:rPr>
+          <w:lang w:val="it-IT"/>
+        </w:rPr>
+      </w:pPr>
+      <w:r>
+        <w:rPr>
+          <w:b/>
+          <w:bCs/>
+          <w:lang w:val="it-IT"/>
+        </w:rPr>
+        <w:t>Interfaccia utente:</w:t>
+      </w:r>
+      <w:r>
+        <w:rPr>
+          <w:lang w:val="it-IT"/>
+        </w:rPr>
+        <w:t> mappa, pannelli per pop e risorse, notifiche per eventi critici.</w:t>
+      </w:r>
+    </w:p>
+    <w:p>
+      <w:pPr>
+        <w:numPr>
+          <w:ilvl w:val="0"/>
+          <w:numId w:val="30"/>
+        </w:numPr>
+        <w:rPr>
+          <w:lang w:val="it-IT"/>
+        </w:rPr>
+      </w:pPr>
+      <w:r>
+        <w:rPr>
+          <w:b/>
+          <w:bCs/>
+          <w:lang w:val="it-IT"/>
+        </w:rPr>
+        <w:t>Filigrana informativa:</w:t>
+      </w:r>
+      <w:r>
+        <w:rPr>
+          <w:lang w:val="it-IT"/>
+        </w:rPr>
+        <w:t> anche le statistiche interne (scorte, felicità) sono filtrate da chi le riporta.</w:t>
+      </w:r>
+    </w:p>
+    <w:p>
+      <w:pPr>
+        <w:pStyle w:val="Heading1"/>
+      </w:pPr>
+      <w:r>
         <w:lastRenderedPageBreak/>
-        <w:t>Informazione</w:t>
+        <w:t xml:space="preserve">Mondo </w:t>
+      </w:r>
+      <w:proofErr w:type="spellStart"/>
+      <w:r>
+        <w:t>simulato</w:t>
       </w:r>
       <w:proofErr w:type="spellEnd"/>
-      <w:r>
-        <w:t xml:space="preserve"> e UI</w:t>
-      </w:r>
-    </w:p>
-    <w:p>
-      <w:pPr>
-        <w:numPr>
-          <w:ilvl w:val="0"/>
-          <w:numId w:val="30"/>
-        </w:numPr>
-        <w:rPr>
-          <w:lang w:val="it-IT"/>
-        </w:rPr>
-      </w:pPr>
-      <w:r>
-        <w:rPr>
-          <w:b/>
-          <w:bCs/>
-          <w:lang w:val="it-IT"/>
-        </w:rPr>
-        <w:t>Visibilità:</w:t>
-      </w:r>
-      <w:r>
-        <w:rPr>
-          <w:lang w:val="it-IT"/>
-        </w:rPr>
-        <w:t> tre stati (certa, da report, proiettata) per ogni entità sulla mappa.</w:t>
-      </w:r>
-    </w:p>
-    <w:p>
-      <w:pPr>
-        <w:numPr>
-          <w:ilvl w:val="0"/>
-          <w:numId w:val="30"/>
-        </w:numPr>
-        <w:rPr>
-          <w:lang w:val="it-IT"/>
-        </w:rPr>
-      </w:pPr>
-      <w:r>
-        <w:rPr>
-          <w:b/>
-          <w:bCs/>
-          <w:lang w:val="it-IT"/>
-        </w:rPr>
-        <w:t>Gestione dei report:</w:t>
-      </w:r>
-      <w:r>
-        <w:rPr>
-          <w:lang w:val="it-IT"/>
-        </w:rPr>
-        <w:t> ritardi e imprecisioni dipendono dalla distanza e dall'affidabilità della fonte.</w:t>
-      </w:r>
-    </w:p>
-    <w:p>
-      <w:pPr>
-        <w:numPr>
-          <w:ilvl w:val="0"/>
-          <w:numId w:val="30"/>
-        </w:numPr>
-        <w:rPr>
-          <w:lang w:val="it-IT"/>
-        </w:rPr>
-      </w:pPr>
-      <w:r>
-        <w:rPr>
-          <w:b/>
-          <w:bCs/>
-          <w:lang w:val="it-IT"/>
-        </w:rPr>
-        <w:t>Interfaccia utente:</w:t>
-      </w:r>
-      <w:r>
-        <w:rPr>
-          <w:lang w:val="it-IT"/>
-        </w:rPr>
-        <w:t> mappa, pannelli per pop e risorse, notifiche per eventi critici.</w:t>
-      </w:r>
-    </w:p>
-    <w:p>
-      <w:pPr>
-        <w:numPr>
-          <w:ilvl w:val="0"/>
-          <w:numId w:val="30"/>
-        </w:numPr>
-        <w:rPr>
-          <w:lang w:val="it-IT"/>
-        </w:rPr>
-      </w:pPr>
-      <w:r>
-        <w:rPr>
-          <w:b/>
-          <w:bCs/>
-          <w:lang w:val="it-IT"/>
-        </w:rPr>
-        <w:t>Filigrana informativa:</w:t>
-      </w:r>
-      <w:r>
-        <w:rPr>
-          <w:lang w:val="it-IT"/>
-        </w:rPr>
-        <w:t> anche le statistiche interne (scorte, felicità) sono filtrate da chi le riporta.</w:t>
+    </w:p>
+    <w:p>
+      <w:pPr>
+        <w:numPr>
+          <w:ilvl w:val="0"/>
+          <w:numId w:val="31"/>
+        </w:numPr>
+        <w:rPr>
+          <w:lang w:val="it-IT"/>
+        </w:rPr>
+      </w:pPr>
+      <w:r>
+        <w:rPr>
+          <w:b/>
+          <w:bCs/>
+          <w:lang w:val="it-IT"/>
+        </w:rPr>
+        <w:t>Clima e stagioni:</w:t>
+      </w:r>
+      <w:r>
+        <w:rPr>
+          <w:lang w:val="it-IT"/>
+        </w:rPr>
+        <w:t> influenzano la produttività agricola, la rigenerazione delle risorse e la migrazione animale.</w:t>
+      </w:r>
+    </w:p>
+    <w:p>
+      <w:pPr>
+        <w:numPr>
+          <w:ilvl w:val="0"/>
+          <w:numId w:val="31"/>
+        </w:numPr>
+        <w:rPr>
+          <w:lang w:val="it-IT"/>
+        </w:rPr>
+      </w:pPr>
+      <w:r>
+        <w:rPr>
+          <w:b/>
+          <w:bCs/>
+          <w:lang w:val="it-IT"/>
+        </w:rPr>
+        <w:t>Migrazioni:</w:t>
+      </w:r>
+      <w:r>
+        <w:rPr>
+          <w:lang w:val="it-IT"/>
+        </w:rPr>
+        <w:t> pop si spostano in base a fattori economici, culturali e di sicurezza.</w:t>
+      </w:r>
+    </w:p>
+    <w:p>
+      <w:pPr>
+        <w:numPr>
+          <w:ilvl w:val="0"/>
+          <w:numId w:val="31"/>
+        </w:numPr>
+        <w:rPr>
+          <w:lang w:val="it-IT"/>
+        </w:rPr>
+      </w:pPr>
+      <w:r>
+        <w:rPr>
+          <w:b/>
+          <w:bCs/>
+          <w:lang w:val="it-IT"/>
+        </w:rPr>
+        <w:t>Malattie:</w:t>
+      </w:r>
+      <w:r>
+        <w:rPr>
+          <w:lang w:val="it-IT"/>
+        </w:rPr>
+        <w:t> si diffondono lungo le rotte commerciali e in condizioni igieniche precarie.</w:t>
+      </w:r>
+    </w:p>
+    <w:p>
+      <w:pPr>
+        <w:numPr>
+          <w:ilvl w:val="0"/>
+          <w:numId w:val="31"/>
+        </w:numPr>
+        <w:rPr>
+          <w:lang w:val="it-IT"/>
+        </w:rPr>
+      </w:pPr>
+      <w:r>
+        <w:rPr>
+          <w:b/>
+          <w:bCs/>
+          <w:lang w:val="it-IT"/>
+        </w:rPr>
+        <w:t>Eventi emergenti:</w:t>
+      </w:r>
+      <w:r>
+        <w:rPr>
+          <w:lang w:val="it-IT"/>
+        </w:rPr>
+        <w:t> carestie, rivoluzioni, guerre civili emergono quando variabili come scarsità di cibo, oppressione fiscale e tensioni etniche superano soglie critiche.</w:t>
+      </w:r>
+    </w:p>
+    <w:p>
+      <w:pPr>
+        <w:numPr>
+          <w:ilvl w:val="0"/>
+          <w:numId w:val="31"/>
+        </w:numPr>
+        <w:rPr>
+          <w:lang w:val="it-IT"/>
+        </w:rPr>
+      </w:pPr>
+      <w:r>
+        <w:rPr>
+          <w:b/>
+          <w:bCs/>
+          <w:lang w:val="it-IT"/>
+        </w:rPr>
+        <w:t>Cicli storici</w:t>
+      </w:r>
+      <w:r>
+        <w:rPr>
+          <w:lang w:val="it-IT"/>
+        </w:rPr>
+        <w:t>: eventi e modificatori spingono per replicare i reali cicli storici</w:t>
       </w:r>
     </w:p>
     <w:p>
@@ -3949,162 +4281,195 @@
         <w:pStyle w:val="Heading1"/>
       </w:pPr>
       <w:r>
-        <w:t xml:space="preserve">Mondo </w:t>
+        <w:t xml:space="preserve">Piano di </w:t>
       </w:r>
       <w:proofErr w:type="spellStart"/>
       <w:r>
-        <w:t>simulato</w:t>
+        <w:t>sviluppo</w:t>
       </w:r>
       <w:proofErr w:type="spellEnd"/>
-    </w:p>
-    <w:p>
-      <w:pPr>
-        <w:numPr>
-          <w:ilvl w:val="0"/>
-          <w:numId w:val="31"/>
-        </w:numPr>
-        <w:rPr>
-          <w:lang w:val="it-IT"/>
-        </w:rPr>
-      </w:pPr>
-      <w:r>
-        <w:rPr>
-          <w:b/>
-          <w:bCs/>
-          <w:lang w:val="it-IT"/>
-        </w:rPr>
-        <w:t>Clima e stagioni:</w:t>
-      </w:r>
-      <w:r>
-        <w:rPr>
-          <w:lang w:val="it-IT"/>
-        </w:rPr>
-        <w:t> influenzano la produttività agricola, la rigenerazione delle risorse e la migrazione animale.</w:t>
-      </w:r>
-    </w:p>
-    <w:p>
-      <w:pPr>
-        <w:numPr>
-          <w:ilvl w:val="0"/>
-          <w:numId w:val="31"/>
-        </w:numPr>
-        <w:rPr>
-          <w:lang w:val="it-IT"/>
-        </w:rPr>
-      </w:pPr>
-      <w:r>
-        <w:rPr>
-          <w:b/>
-          <w:bCs/>
-          <w:lang w:val="it-IT"/>
-        </w:rPr>
-        <w:t>Migrazioni:</w:t>
-      </w:r>
-      <w:r>
-        <w:rPr>
-          <w:lang w:val="it-IT"/>
-        </w:rPr>
-        <w:t> pop si spostano in base a fattori economici, culturali e di sicurezza.</w:t>
-      </w:r>
-    </w:p>
-    <w:p>
-      <w:pPr>
-        <w:numPr>
-          <w:ilvl w:val="0"/>
-          <w:numId w:val="31"/>
-        </w:numPr>
-        <w:rPr>
-          <w:lang w:val="it-IT"/>
-        </w:rPr>
-      </w:pPr>
-      <w:r>
-        <w:rPr>
-          <w:b/>
-          <w:bCs/>
-          <w:lang w:val="it-IT"/>
-        </w:rPr>
-        <w:t>Malattie:</w:t>
-      </w:r>
-      <w:r>
-        <w:rPr>
-          <w:lang w:val="it-IT"/>
-        </w:rPr>
-        <w:t> si diffondono lungo le rotte commerciali e in condizioni igieniche precarie.</w:t>
-      </w:r>
-    </w:p>
-    <w:p>
-      <w:pPr>
-        <w:numPr>
-          <w:ilvl w:val="0"/>
-          <w:numId w:val="31"/>
-        </w:numPr>
-        <w:rPr>
-          <w:lang w:val="it-IT"/>
-        </w:rPr>
-      </w:pPr>
-      <w:r>
-        <w:rPr>
-          <w:b/>
-          <w:bCs/>
-          <w:lang w:val="it-IT"/>
-        </w:rPr>
-        <w:t>Eventi emergenti:</w:t>
-      </w:r>
-      <w:r>
-        <w:rPr>
-          <w:lang w:val="it-IT"/>
-        </w:rPr>
-        <w:t> carestie, rivoluzioni, guerre civili emergono quando variabili come scarsità di cibo, oppressione fiscale e tensioni etniche superano soglie critiche.</w:t>
-      </w:r>
-    </w:p>
-    <w:p>
-      <w:pPr>
-        <w:numPr>
-          <w:ilvl w:val="0"/>
-          <w:numId w:val="31"/>
-        </w:numPr>
-        <w:rPr>
-          <w:lang w:val="it-IT"/>
-        </w:rPr>
-      </w:pPr>
-      <w:r>
-        <w:rPr>
-          <w:b/>
-          <w:bCs/>
-          <w:lang w:val="it-IT"/>
-        </w:rPr>
-        <w:t>Cicli storici</w:t>
-      </w:r>
-      <w:r>
-        <w:rPr>
-          <w:lang w:val="it-IT"/>
-        </w:rPr>
-        <w:t>: eventi e modificatori spingono per replicare i reali cicli storici</w:t>
-      </w:r>
-    </w:p>
-    <w:p>
-      <w:pPr>
-        <w:pStyle w:val="Heading1"/>
-      </w:pPr>
-      <w:r>
-        <w:t xml:space="preserve">Piano di </w:t>
+      <w:r>
+        <w:t xml:space="preserve"> </w:t>
       </w:r>
       <w:proofErr w:type="spellStart"/>
       <w:r>
-        <w:t>sviluppo</w:t>
+        <w:t>tecnico</w:t>
       </w:r>
       <w:proofErr w:type="spellEnd"/>
-      <w:r>
+    </w:p>
+    <w:p>
+      <w:pPr>
+        <w:numPr>
+          <w:ilvl w:val="0"/>
+          <w:numId w:val="32"/>
+        </w:numPr>
+        <w:rPr>
+          <w:lang w:val="it-IT"/>
+        </w:rPr>
+      </w:pPr>
+      <w:r>
+        <w:rPr>
+          <w:b/>
+          <w:bCs/>
+          <w:lang w:val="it-IT"/>
+        </w:rPr>
+        <w:t>Stack:</w:t>
+      </w:r>
+      <w:r>
+        <w:rPr>
+          <w:lang w:val="it-IT"/>
+        </w:rPr>
+        <w:t> </w:t>
+      </w:r>
+      <w:proofErr w:type="spellStart"/>
+      <w:r>
+        <w:rPr>
+          <w:lang w:val="it-IT"/>
+        </w:rPr>
+        <w:t>Phaser</w:t>
+      </w:r>
+      <w:proofErr w:type="spellEnd"/>
+      <w:r>
+        <w:rPr>
+          <w:lang w:val="it-IT"/>
+        </w:rPr>
+        <w:t xml:space="preserve"> 3 per il prototipo 2D; in futuro migrazione a motore 3D (es. Three.js o Unity) per la versione finale in stile </w:t>
+      </w:r>
+      <w:proofErr w:type="spellStart"/>
+      <w:r>
+        <w:rPr>
+          <w:lang w:val="it-IT"/>
+        </w:rPr>
+        <w:t>Crusader</w:t>
+      </w:r>
+      <w:proofErr w:type="spellEnd"/>
+      <w:r>
+        <w:rPr>
+          <w:lang w:val="it-IT"/>
+        </w:rPr>
+        <w:t xml:space="preserve"> Kings 3.</w:t>
+      </w:r>
+    </w:p>
+    <w:p>
+      <w:pPr>
+        <w:numPr>
+          <w:ilvl w:val="0"/>
+          <w:numId w:val="32"/>
+        </w:numPr>
+        <w:rPr>
+          <w:lang w:val="it-IT"/>
+        </w:rPr>
+      </w:pPr>
+      <w:r>
+        <w:rPr>
+          <w:b/>
+          <w:bCs/>
+          <w:lang w:val="it-IT"/>
+        </w:rPr>
+        <w:t>Architettura:</w:t>
+      </w:r>
+      <w:r>
+        <w:rPr>
+          <w:lang w:val="it-IT"/>
+        </w:rPr>
+        <w:t> descritta nel documento TECHNICAL.md.</w:t>
+      </w:r>
+    </w:p>
+    <w:p>
+      <w:pPr>
+        <w:numPr>
+          <w:ilvl w:val="0"/>
+          <w:numId w:val="32"/>
+        </w:numPr>
+        <w:rPr>
+          <w:lang w:val="it-IT"/>
+        </w:rPr>
+      </w:pPr>
+      <w:r>
+        <w:rPr>
+          <w:b/>
+          <w:bCs/>
+          <w:lang w:val="it-IT"/>
+        </w:rPr>
+        <w:t>Performance:</w:t>
+      </w:r>
+      <w:r>
+        <w:rPr>
+          <w:lang w:val="it-IT"/>
+        </w:rPr>
+        <w:t> monitorare il numero di entità e la dimensione della griglia spaziale per garantire fluidità con migliaia di pop e branchi.</w:t>
+      </w:r>
+    </w:p>
+    <w:p>
+      <w:pPr>
+        <w:numPr>
+          <w:ilvl w:val="0"/>
+          <w:numId w:val="32"/>
+        </w:numPr>
+        <w:rPr>
+          <w:lang w:val="it-IT"/>
+        </w:rPr>
+      </w:pPr>
+      <w:r>
+        <w:rPr>
+          <w:b/>
+          <w:bCs/>
+          <w:lang w:val="it-IT"/>
+        </w:rPr>
+        <w:t>Scalabilità:</w:t>
+      </w:r>
+      <w:r>
+        <w:rPr>
+          <w:lang w:val="it-IT"/>
+        </w:rPr>
+        <w:t xml:space="preserve"> la struttura a </w:t>
+      </w:r>
+      <w:proofErr w:type="spellStart"/>
+      <w:r>
+        <w:rPr>
+          <w:lang w:val="it-IT"/>
+        </w:rPr>
+        <w:t>layer</w:t>
+      </w:r>
+      <w:proofErr w:type="spellEnd"/>
+      <w:r>
+        <w:rPr>
+          <w:lang w:val="it-IT"/>
+        </w:rPr>
+        <w:t xml:space="preserve"> di densità e lo </w:t>
+      </w:r>
+      <w:proofErr w:type="spellStart"/>
+      <w:r>
+        <w:rPr>
+          <w:lang w:val="it-IT"/>
+        </w:rPr>
+        <w:t>spatial</w:t>
+      </w:r>
+      <w:proofErr w:type="spellEnd"/>
+      <w:r>
+        <w:rPr>
+          <w:lang w:val="it-IT"/>
+        </w:rPr>
         <w:t xml:space="preserve"> </w:t>
       </w:r>
       <w:proofErr w:type="spellStart"/>
       <w:r>
-        <w:t>tecnico</w:t>
+        <w:rPr>
+          <w:lang w:val="it-IT"/>
+        </w:rPr>
+        <w:t>hashing</w:t>
       </w:r>
       <w:proofErr w:type="spellEnd"/>
-    </w:p>
-    <w:p>
-      <w:pPr>
+      <w:r>
+        <w:rPr>
+          <w:lang w:val="it-IT"/>
+        </w:rPr>
+        <w:t xml:space="preserve"> sono pensati per supportare mappe molto ampie e simulazioni complesse.</w:t>
+      </w:r>
+    </w:p>
+    <w:p>
+      <w:pPr>
+        <w:pStyle w:val="ListParagraph"/>
         <w:numPr>
           <w:ilvl w:val="0"/>
           <w:numId w:val="32"/>
@@ -4119,159 +4484,64 @@
           <w:bCs/>
           <w:lang w:val="it-IT"/>
         </w:rPr>
-        <w:t>Stack:</w:t>
-      </w:r>
-      <w:r>
-        <w:rPr>
-          <w:lang w:val="it-IT"/>
-        </w:rPr>
-        <w:t> </w:t>
+        <w:t>Configurazione e debug</w:t>
+      </w:r>
+      <w:r>
+        <w:rPr>
+          <w:lang w:val="it-IT"/>
+        </w:rPr>
+        <w:t xml:space="preserve">: i parametri di gioco sono centralizzati in </w:t>
       </w:r>
       <w:proofErr w:type="spellStart"/>
       <w:r>
         <w:rPr>
           <w:lang w:val="it-IT"/>
         </w:rPr>
-        <w:t>Phaser</w:t>
+        <w:t>GameConfig</w:t>
       </w:r>
       <w:proofErr w:type="spellEnd"/>
       <w:r>
         <w:rPr>
           <w:lang w:val="it-IT"/>
         </w:rPr>
-        <w:t xml:space="preserve"> 3 per il prototipo 2D; in futuro migrazione a motore 3D (es. Three.js o Unity) per la versione finale in stile </w:t>
+        <w:t xml:space="preserve"> (</w:t>
       </w:r>
       <w:proofErr w:type="spellStart"/>
       <w:r>
         <w:rPr>
           <w:lang w:val="it-IT"/>
         </w:rPr>
-        <w:t>Crusader</w:t>
+        <w:t>js</w:t>
       </w:r>
       <w:proofErr w:type="spellEnd"/>
       <w:r>
         <w:rPr>
           <w:lang w:val="it-IT"/>
         </w:rPr>
-        <w:t xml:space="preserve"> Kings 3.</w:t>
-      </w:r>
-    </w:p>
-    <w:p>
-      <w:pPr>
-        <w:numPr>
-          <w:ilvl w:val="0"/>
-          <w:numId w:val="32"/>
-        </w:numPr>
-        <w:rPr>
-          <w:lang w:val="it-IT"/>
-        </w:rPr>
-      </w:pPr>
-      <w:r>
-        <w:rPr>
-          <w:b/>
-          <w:bCs/>
-          <w:lang w:val="it-IT"/>
-        </w:rPr>
-        <w:t>Architettura:</w:t>
-      </w:r>
-      <w:r>
-        <w:rPr>
-          <w:lang w:val="it-IT"/>
-        </w:rPr>
-        <w:t> descritta nel documento TECHNICAL.md.</w:t>
-      </w:r>
-    </w:p>
-    <w:p>
-      <w:pPr>
-        <w:numPr>
-          <w:ilvl w:val="0"/>
-          <w:numId w:val="32"/>
-        </w:numPr>
-        <w:rPr>
-          <w:lang w:val="it-IT"/>
-        </w:rPr>
-      </w:pPr>
-      <w:r>
-        <w:rPr>
-          <w:b/>
-          <w:bCs/>
-          <w:lang w:val="it-IT"/>
-        </w:rPr>
-        <w:t>Performance:</w:t>
-      </w:r>
-      <w:r>
-        <w:rPr>
-          <w:lang w:val="it-IT"/>
-        </w:rPr>
-        <w:t> monitorare il numero di entità e la dimensione della griglia spaziale per garantire fluidità con migliaia di pop e branchi.</w:t>
-      </w:r>
-    </w:p>
-    <w:p>
-      <w:pPr>
-        <w:numPr>
-          <w:ilvl w:val="0"/>
-          <w:numId w:val="32"/>
-        </w:numPr>
-        <w:rPr>
-          <w:lang w:val="it-IT"/>
-        </w:rPr>
-      </w:pPr>
-      <w:r>
-        <w:rPr>
-          <w:b/>
-          <w:bCs/>
-          <w:lang w:val="it-IT"/>
-        </w:rPr>
-        <w:t>Scalabilità:</w:t>
-      </w:r>
-      <w:r>
-        <w:rPr>
-          <w:lang w:val="it-IT"/>
-        </w:rPr>
-        <w:t xml:space="preserve"> la struttura a </w:t>
+        <w:t xml:space="preserve">/config.js) e modificabili a </w:t>
       </w:r>
       <w:proofErr w:type="spellStart"/>
       <w:r>
         <w:rPr>
           <w:lang w:val="it-IT"/>
         </w:rPr>
-        <w:t>layer</w:t>
+        <w:t>runtime</w:t>
       </w:r>
       <w:proofErr w:type="spellEnd"/>
       <w:r>
         <w:rPr>
           <w:lang w:val="it-IT"/>
         </w:rPr>
-        <w:t xml:space="preserve"> di densità e lo </w:t>
-      </w:r>
-      <w:proofErr w:type="spellStart"/>
-      <w:r>
-        <w:rPr>
-          <w:lang w:val="it-IT"/>
-        </w:rPr>
-        <w:t>spatial</w:t>
-      </w:r>
-      <w:proofErr w:type="spellEnd"/>
-      <w:r>
-        <w:rPr>
-          <w:lang w:val="it-IT"/>
-        </w:rPr>
-        <w:t xml:space="preserve"> </w:t>
-      </w:r>
-      <w:proofErr w:type="spellStart"/>
-      <w:r>
-        <w:rPr>
-          <w:lang w:val="it-IT"/>
-        </w:rPr>
-        <w:t>hashing</w:t>
-      </w:r>
-      <w:proofErr w:type="spellEnd"/>
-      <w:r>
-        <w:rPr>
-          <w:lang w:val="it-IT"/>
-        </w:rPr>
-        <w:t xml:space="preserve"> sono pensati per supportare mappe molto ampie e simulazioni complesse.</w:t>
-      </w:r>
+        <w:t xml:space="preserve"> tramite pannello di debug o console. Questo permette di bilanciare il prototipo senza toccare il codice.</w:t>
+      </w:r>
+    </w:p>
+    <w:p>
+      <w:pPr>
+        <w:ind w:left="720"/>
+        <w:rPr>
+          <w:lang w:val="it-IT"/>
+        </w:rPr>
+      </w:pPr>
     </w:p>
     <w:p>
       <w:pPr>
@@ -6636,6 +6906,119 @@
     </w:lvl>
   </w:abstractNum>
   <w:abstractNum w:abstractNumId="17" w15:restartNumberingAfterBreak="0">
+    <w:nsid w:val="39302BCC"/>
+    <w:multiLevelType w:val="hybridMultilevel"/>
+    <w:tmpl w:val="EC4E1314"/>
+    <w:lvl w:ilvl="0" w:tplc="08090001">
+      <w:start w:val="1"/>
+      <w:numFmt w:val="bullet"/>
+      <w:lvlText w:val=""/>
+      <w:lvlJc w:val="left"/>
+      <w:pPr>
+        <w:ind w:left="720" w:hanging="360"/>
+      </w:pPr>
+      <w:rPr>
+        <w:rFonts w:ascii="Symbol" w:hAnsi="Symbol" w:hint="default"/>
+      </w:rPr>
+    </w:lvl>
+    <w:lvl w:ilvl="1" w:tplc="08090003" w:tentative="1">
+      <w:start w:val="1"/>
+      <w:numFmt w:val="bullet"/>
+      <w:lvlText w:val="o"/>
+      <w:lvlJc w:val="left"/>
+      <w:pPr>
+        <w:ind w:left="1440" w:hanging="360"/>
+      </w:pPr>
+      <w:rPr>
+        <w:rFonts w:ascii="Courier New" w:hAnsi="Courier New" w:cs="Courier New" w:hint="default"/>
+      </w:rPr>
+    </w:lvl>
+    <w:lvl w:ilvl="2" w:tplc="08090005" w:tentative="1">
+      <w:start w:val="1"/>
+      <w:numFmt w:val="bullet"/>
+      <w:lvlText w:val=""/>
+      <w:lvlJc w:val="left"/>
+      <w:pPr>
+        <w:ind w:left="2160" w:hanging="360"/>
+      </w:pPr>
+      <w:rPr>
+        <w:rFonts w:ascii="Wingdings" w:hAnsi="Wingdings" w:hint="default"/>
+      </w:rPr>
+    </w:lvl>
+    <w:lvl w:ilvl="3" w:tplc="08090001" w:tentative="1">
+      <w:start w:val="1"/>
+      <w:numFmt w:val="bullet"/>
+      <w:lvlText w:val=""/>
+      <w:lvlJc w:val="left"/>
+      <w:pPr>
+        <w:ind w:left="2880" w:hanging="360"/>
+      </w:pPr>
+      <w:rPr>
+        <w:rFonts w:ascii="Symbol" w:hAnsi="Symbol" w:hint="default"/>
+      </w:rPr>
+    </w:lvl>
+    <w:lvl w:ilvl="4" w:tplc="08090003" w:tentative="1">
+      <w:start w:val="1"/>
+      <w:numFmt w:val="bullet"/>
+      <w:lvlText w:val="o"/>
+      <w:lvlJc w:val="left"/>
+      <w:pPr>
+        <w:ind w:left="3600" w:hanging="360"/>
+      </w:pPr>
+      <w:rPr>
+        <w:rFonts w:ascii="Courier New" w:hAnsi="Courier New" w:cs="Courier New" w:hint="default"/>
+      </w:rPr>
+    </w:lvl>
+    <w:lvl w:ilvl="5" w:tplc="08090005" w:tentative="1">
+      <w:start w:val="1"/>
+      <w:numFmt w:val="bullet"/>
+      <w:lvlText w:val=""/>
+      <w:lvlJc w:val="left"/>
+      <w:pPr>
+        <w:ind w:left="4320" w:hanging="360"/>
+      </w:pPr>
+      <w:rPr>
+        <w:rFonts w:ascii="Wingdings" w:hAnsi="Wingdings" w:hint="default"/>
+      </w:rPr>
+    </w:lvl>
+    <w:lvl w:ilvl="6" w:tplc="08090001" w:tentative="1">
+      <w:start w:val="1"/>
+      <w:numFmt w:val="bullet"/>
+      <w:lvlText w:val=""/>
+      <w:lvlJc w:val="left"/>
+      <w:pPr>
+        <w:ind w:left="5040" w:hanging="360"/>
+      </w:pPr>
+      <w:rPr>
+        <w:rFonts w:ascii="Symbol" w:hAnsi="Symbol" w:hint="default"/>
+      </w:rPr>
+    </w:lvl>
+    <w:lvl w:ilvl="7" w:tplc="08090003" w:tentative="1">
+      <w:start w:val="1"/>
+      <w:numFmt w:val="bullet"/>
+      <w:lvlText w:val="o"/>
+      <w:lvlJc w:val="left"/>
+      <w:pPr>
+        <w:ind w:left="5760" w:hanging="360"/>
+      </w:pPr>
+      <w:rPr>
+        <w:rFonts w:ascii="Courier New" w:hAnsi="Courier New" w:cs="Courier New" w:hint="default"/>
+      </w:rPr>
+    </w:lvl>
+    <w:lvl w:ilvl="8" w:tplc="08090005" w:tentative="1">
+      <w:start w:val="1"/>
+      <w:numFmt w:val="bullet"/>
+      <w:lvlText w:val=""/>
+      <w:lvlJc w:val="left"/>
+      <w:pPr>
+        <w:ind w:left="6480" w:hanging="360"/>
+      </w:pPr>
+      <w:rPr>
+        <w:rFonts w:ascii="Wingdings" w:hAnsi="Wingdings" w:hint="default"/>
+      </w:rPr>
+    </w:lvl>
+  </w:abstractNum>
+  <w:abstractNum w:abstractNumId="18" w15:restartNumberingAfterBreak="0">
     <w:nsid w:val="3F41591C"/>
     <w:multiLevelType w:val="multilevel"/>
     <w:tmpl w:val="469402C4"/>
@@ -6651,7 +7034,6 @@
     <w:lvl w:ilvl="1">
       <w:start w:val="1"/>
       <w:numFmt w:val="decimal"/>
-      <w:pStyle w:val="Heading2"/>
       <w:lvlText w:val="%1.%2."/>
       <w:lvlJc w:val="left"/>
       <w:pPr>
@@ -6722,7 +7104,7 @@
       </w:pPr>
     </w:lvl>
   </w:abstractNum>
-  <w:abstractNum w:abstractNumId="18" w15:restartNumberingAfterBreak="0">
+  <w:abstractNum w:abstractNumId="19" w15:restartNumberingAfterBreak="0">
     <w:nsid w:val="44077402"/>
     <w:multiLevelType w:val="multilevel"/>
     <w:tmpl w:val="8F3C5300"/>
@@ -6871,7 +7253,7 @@
       </w:rPr>
     </w:lvl>
   </w:abstractNum>
-  <w:abstractNum w:abstractNumId="19" w15:restartNumberingAfterBreak="0">
+  <w:abstractNum w:abstractNumId="20" w15:restartNumberingAfterBreak="0">
     <w:nsid w:val="4B2E74F5"/>
     <w:multiLevelType w:val="multilevel"/>
     <w:tmpl w:val="749CDDEA"/>
@@ -7020,7 +7402,7 @@
       </w:rPr>
     </w:lvl>
   </w:abstractNum>
-  <w:abstractNum w:abstractNumId="20" w15:restartNumberingAfterBreak="0">
+  <w:abstractNum w:abstractNumId="21" w15:restartNumberingAfterBreak="0">
     <w:nsid w:val="4E5C6A14"/>
     <w:multiLevelType w:val="multilevel"/>
     <w:tmpl w:val="A24A7FAC"/>
@@ -7169,7 +7551,7 @@
       </w:rPr>
     </w:lvl>
   </w:abstractNum>
-  <w:abstractNum w:abstractNumId="21" w15:restartNumberingAfterBreak="0">
+  <w:abstractNum w:abstractNumId="22" w15:restartNumberingAfterBreak="0">
     <w:nsid w:val="538273CB"/>
     <w:multiLevelType w:val="multilevel"/>
     <w:tmpl w:val="0C66EB3A"/>
@@ -7318,7 +7700,119 @@
       </w:rPr>
     </w:lvl>
   </w:abstractNum>
-  <w:abstractNum w:abstractNumId="22" w15:restartNumberingAfterBreak="0">
+  <w:abstractNum w:abstractNumId="23" w15:restartNumberingAfterBreak="0">
+    <w:nsid w:val="5D7D4E73"/>
+    <w:multiLevelType w:val="hybridMultilevel"/>
+    <w:tmpl w:val="FE689998"/>
+    <w:lvl w:ilvl="0" w:tplc="DDDAB6CA">
+      <w:numFmt w:val="bullet"/>
+      <w:lvlText w:val="-"/>
+      <w:lvlJc w:val="left"/>
+      <w:pPr>
+        <w:ind w:left="720" w:hanging="360"/>
+      </w:pPr>
+      <w:rPr>
+        <w:rFonts w:ascii="Calibri" w:eastAsiaTheme="minorHAnsi" w:hAnsi="Calibri" w:cs="Calibri" w:hint="default"/>
+      </w:rPr>
+    </w:lvl>
+    <w:lvl w:ilvl="1" w:tplc="08090003" w:tentative="1">
+      <w:start w:val="1"/>
+      <w:numFmt w:val="bullet"/>
+      <w:lvlText w:val="o"/>
+      <w:lvlJc w:val="left"/>
+      <w:pPr>
+        <w:ind w:left="1440" w:hanging="360"/>
+      </w:pPr>
+      <w:rPr>
+        <w:rFonts w:ascii="Courier New" w:hAnsi="Courier New" w:cs="Courier New" w:hint="default"/>
+      </w:rPr>
+    </w:lvl>
+    <w:lvl w:ilvl="2" w:tplc="08090005" w:tentative="1">
+      <w:start w:val="1"/>
+      <w:numFmt w:val="bullet"/>
+      <w:lvlText w:val=""/>
+      <w:lvlJc w:val="left"/>
+      <w:pPr>
+        <w:ind w:left="2160" w:hanging="360"/>
+      </w:pPr>
+      <w:rPr>
+        <w:rFonts w:ascii="Wingdings" w:hAnsi="Wingdings" w:hint="default"/>
+      </w:rPr>
+    </w:lvl>
+    <w:lvl w:ilvl="3" w:tplc="08090001" w:tentative="1">
+      <w:start w:val="1"/>
+      <w:numFmt w:val="bullet"/>
+      <w:lvlText w:val=""/>
+      <w:lvlJc w:val="left"/>
+      <w:pPr>
+        <w:ind w:left="2880" w:hanging="360"/>
+      </w:pPr>
+      <w:rPr>
+        <w:rFonts w:ascii="Symbol" w:hAnsi="Symbol" w:hint="default"/>
+      </w:rPr>
+    </w:lvl>
+    <w:lvl w:ilvl="4" w:tplc="08090003" w:tentative="1">
+      <w:start w:val="1"/>
+      <w:numFmt w:val="bullet"/>
+      <w:lvlText w:val="o"/>
+      <w:lvlJc w:val="left"/>
+      <w:pPr>
+        <w:ind w:left="3600" w:hanging="360"/>
+      </w:pPr>
+      <w:rPr>
+        <w:rFonts w:ascii="Courier New" w:hAnsi="Courier New" w:cs="Courier New" w:hint="default"/>
+      </w:rPr>
+    </w:lvl>
+    <w:lvl w:ilvl="5" w:tplc="08090005" w:tentative="1">
+      <w:start w:val="1"/>
+      <w:numFmt w:val="bullet"/>
+      <w:lvlText w:val=""/>
+      <w:lvlJc w:val="left"/>
+      <w:pPr>
+        <w:ind w:left="4320" w:hanging="360"/>
+      </w:pPr>
+      <w:rPr>
+        <w:rFonts w:ascii="Wingdings" w:hAnsi="Wingdings" w:hint="default"/>
+      </w:rPr>
+    </w:lvl>
+    <w:lvl w:ilvl="6" w:tplc="08090001" w:tentative="1">
+      <w:start w:val="1"/>
+      <w:numFmt w:val="bullet"/>
+      <w:lvlText w:val=""/>
+      <w:lvlJc w:val="left"/>
+      <w:pPr>
+        <w:ind w:left="5040" w:hanging="360"/>
+      </w:pPr>
+      <w:rPr>
+        <w:rFonts w:ascii="Symbol" w:hAnsi="Symbol" w:hint="default"/>
+      </w:rPr>
+    </w:lvl>
+    <w:lvl w:ilvl="7" w:tplc="08090003" w:tentative="1">
+      <w:start w:val="1"/>
+      <w:numFmt w:val="bullet"/>
+      <w:lvlText w:val="o"/>
+      <w:lvlJc w:val="left"/>
+      <w:pPr>
+        <w:ind w:left="5760" w:hanging="360"/>
+      </w:pPr>
+      <w:rPr>
+        <w:rFonts w:ascii="Courier New" w:hAnsi="Courier New" w:cs="Courier New" w:hint="default"/>
+      </w:rPr>
+    </w:lvl>
+    <w:lvl w:ilvl="8" w:tplc="08090005" w:tentative="1">
+      <w:start w:val="1"/>
+      <w:numFmt w:val="bullet"/>
+      <w:lvlText w:val=""/>
+      <w:lvlJc w:val="left"/>
+      <w:pPr>
+        <w:ind w:left="6480" w:hanging="360"/>
+      </w:pPr>
+      <w:rPr>
+        <w:rFonts w:ascii="Wingdings" w:hAnsi="Wingdings" w:hint="default"/>
+      </w:rPr>
+    </w:lvl>
+  </w:abstractNum>
+  <w:abstractNum w:abstractNumId="24" w15:restartNumberingAfterBreak="0">
     <w:nsid w:val="64BA0F80"/>
     <w:multiLevelType w:val="multilevel"/>
     <w:tmpl w:val="AF2251EE"/>
@@ -7467,7 +7961,7 @@
       </w:rPr>
     </w:lvl>
   </w:abstractNum>
-  <w:abstractNum w:abstractNumId="23" w15:restartNumberingAfterBreak="0">
+  <w:abstractNum w:abstractNumId="25" w15:restartNumberingAfterBreak="0">
     <w:nsid w:val="665768B2"/>
     <w:multiLevelType w:val="multilevel"/>
     <w:tmpl w:val="98BE4DE4"/>
@@ -7616,7 +8110,7 @@
       </w:rPr>
     </w:lvl>
   </w:abstractNum>
-  <w:abstractNum w:abstractNumId="24" w15:restartNumberingAfterBreak="0">
+  <w:abstractNum w:abstractNumId="26" w15:restartNumberingAfterBreak="0">
     <w:nsid w:val="66C27C1E"/>
     <w:multiLevelType w:val="multilevel"/>
     <w:tmpl w:val="A9CEC058"/>
@@ -7765,7 +8259,7 @@
       </w:rPr>
     </w:lvl>
   </w:abstractNum>
-  <w:abstractNum w:abstractNumId="25" w15:restartNumberingAfterBreak="0">
+  <w:abstractNum w:abstractNumId="27" w15:restartNumberingAfterBreak="0">
     <w:nsid w:val="675155B1"/>
     <w:multiLevelType w:val="multilevel"/>
     <w:tmpl w:val="76A07240"/>
@@ -7914,7 +8408,7 @@
       </w:rPr>
     </w:lvl>
   </w:abstractNum>
-  <w:abstractNum w:abstractNumId="26" w15:restartNumberingAfterBreak="0">
+  <w:abstractNum w:abstractNumId="28" w15:restartNumberingAfterBreak="0">
     <w:nsid w:val="6C152091"/>
     <w:multiLevelType w:val="multilevel"/>
     <w:tmpl w:val="1692526E"/>
@@ -8063,7 +8557,7 @@
       </w:rPr>
     </w:lvl>
   </w:abstractNum>
-  <w:abstractNum w:abstractNumId="27" w15:restartNumberingAfterBreak="0">
+  <w:abstractNum w:abstractNumId="29" w15:restartNumberingAfterBreak="0">
     <w:nsid w:val="704255B1"/>
     <w:multiLevelType w:val="multilevel"/>
     <w:tmpl w:val="462C5802"/>
@@ -8212,7 +8706,7 @@
       </w:rPr>
     </w:lvl>
   </w:abstractNum>
-  <w:abstractNum w:abstractNumId="28" w15:restartNumberingAfterBreak="0">
+  <w:abstractNum w:abstractNumId="30" w15:restartNumberingAfterBreak="0">
     <w:nsid w:val="79A57099"/>
     <w:multiLevelType w:val="multilevel"/>
     <w:tmpl w:val="E0DABB5C"/>
@@ -8361,7 +8855,7 @@
       </w:rPr>
     </w:lvl>
   </w:abstractNum>
-  <w:abstractNum w:abstractNumId="29" w15:restartNumberingAfterBreak="0">
+  <w:abstractNum w:abstractNumId="31" w15:restartNumberingAfterBreak="0">
     <w:nsid w:val="7B111B37"/>
     <w:multiLevelType w:val="multilevel"/>
     <w:tmpl w:val="27BA67BA"/>
@@ -8447,7 +8941,7 @@
       </w:pPr>
     </w:lvl>
   </w:abstractNum>
-  <w:abstractNum w:abstractNumId="30" w15:restartNumberingAfterBreak="0">
+  <w:abstractNum w:abstractNumId="32" w15:restartNumberingAfterBreak="0">
     <w:nsid w:val="7BA1144A"/>
     <w:multiLevelType w:val="multilevel"/>
     <w:tmpl w:val="06D0CE7E"/>
@@ -8596,7 +9090,7 @@
       </w:rPr>
     </w:lvl>
   </w:abstractNum>
-  <w:abstractNum w:abstractNumId="31" w15:restartNumberingAfterBreak="0">
+  <w:abstractNum w:abstractNumId="33" w15:restartNumberingAfterBreak="0">
     <w:nsid w:val="7F8C68BA"/>
     <w:multiLevelType w:val="multilevel"/>
     <w:tmpl w:val="FCDAFE2A"/>
@@ -8745,7 +9239,7 @@
     <w:abstractNumId w:val="16"/>
   </w:num>
   <w:num w:numId="2" w16cid:durableId="1897934086">
-    <w:abstractNumId w:val="29"/>
+    <w:abstractNumId w:val="31"/>
   </w:num>
   <w:num w:numId="3" w16cid:durableId="2015913491">
     <w:abstractNumId w:val="7"/>
@@ -8754,10 +9248,10 @@
     <w:abstractNumId w:val="13"/>
   </w:num>
   <w:num w:numId="5" w16cid:durableId="1782459442">
-    <w:abstractNumId w:val="21"/>
+    <w:abstractNumId w:val="22"/>
   </w:num>
   <w:num w:numId="6" w16cid:durableId="1203782223">
-    <w:abstractNumId w:val="25"/>
+    <w:abstractNumId w:val="27"/>
   </w:num>
   <w:num w:numId="7" w16cid:durableId="1910339401">
     <w:abstractNumId w:val="9"/>
@@ -8766,19 +9260,19 @@
     <w:abstractNumId w:val="0"/>
   </w:num>
   <w:num w:numId="9" w16cid:durableId="1340543577">
-    <w:abstractNumId w:val="26"/>
+    <w:abstractNumId w:val="28"/>
   </w:num>
   <w:num w:numId="10" w16cid:durableId="1861702556">
     <w:abstractNumId w:val="1"/>
   </w:num>
   <w:num w:numId="11" w16cid:durableId="913048856">
-    <w:abstractNumId w:val="20"/>
+    <w:abstractNumId w:val="21"/>
   </w:num>
   <w:num w:numId="12" w16cid:durableId="613368900">
     <w:abstractNumId w:val="6"/>
   </w:num>
   <w:num w:numId="13" w16cid:durableId="1673138174">
-    <w:abstractNumId w:val="17"/>
+    <w:abstractNumId w:val="18"/>
   </w:num>
   <w:num w:numId="14" w16cid:durableId="266734770">
     <w:abstractNumId w:val="12"/>
@@ -8790,10 +9284,10 @@
     <w:abstractNumId w:val="4"/>
   </w:num>
   <w:num w:numId="17" w16cid:durableId="403723686">
-    <w:abstractNumId w:val="31"/>
+    <w:abstractNumId w:val="33"/>
   </w:num>
   <w:num w:numId="18" w16cid:durableId="1139765559">
-    <w:abstractNumId w:val="31"/>
+    <w:abstractNumId w:val="33"/>
     <w:lvlOverride w:ilvl="1">
       <w:lvl w:ilvl="1">
         <w:numFmt w:val="bullet"/>
@@ -8813,7 +9307,7 @@
     </w:lvlOverride>
   </w:num>
   <w:num w:numId="19" w16cid:durableId="924457718">
-    <w:abstractNumId w:val="24"/>
+    <w:abstractNumId w:val="26"/>
   </w:num>
   <w:num w:numId="20" w16cid:durableId="1367441143">
     <w:abstractNumId w:val="8"/>
@@ -8825,19 +9319,19 @@
     <w:abstractNumId w:val="2"/>
   </w:num>
   <w:num w:numId="23" w16cid:durableId="1427379663">
-    <w:abstractNumId w:val="23"/>
+    <w:abstractNumId w:val="25"/>
   </w:num>
   <w:num w:numId="24" w16cid:durableId="875236534">
-    <w:abstractNumId w:val="22"/>
+    <w:abstractNumId w:val="24"/>
   </w:num>
   <w:num w:numId="25" w16cid:durableId="176307190">
-    <w:abstractNumId w:val="19"/>
+    <w:abstractNumId w:val="20"/>
   </w:num>
   <w:num w:numId="26" w16cid:durableId="332149385">
     <w:abstractNumId w:val="10"/>
   </w:num>
   <w:num w:numId="27" w16cid:durableId="803349436">
-    <w:abstractNumId w:val="28"/>
+    <w:abstractNumId w:val="30"/>
   </w:num>
   <w:num w:numId="28" w16cid:durableId="1560675731">
     <w:abstractNumId w:val="14"/>
@@ -8846,16 +9340,22 @@
     <w:abstractNumId w:val="5"/>
   </w:num>
   <w:num w:numId="30" w16cid:durableId="1766462116">
-    <w:abstractNumId w:val="27"/>
+    <w:abstractNumId w:val="29"/>
   </w:num>
   <w:num w:numId="31" w16cid:durableId="1005471834">
-    <w:abstractNumId w:val="18"/>
+    <w:abstractNumId w:val="19"/>
   </w:num>
   <w:num w:numId="32" w16cid:durableId="486094604">
-    <w:abstractNumId w:val="30"/>
+    <w:abstractNumId w:val="32"/>
   </w:num>
   <w:num w:numId="33" w16cid:durableId="1967587877">
     <w:abstractNumId w:val="3"/>
+  </w:num>
+  <w:num w:numId="34" w16cid:durableId="530149297">
+    <w:abstractNumId w:val="17"/>
+  </w:num>
+  <w:num w:numId="35" w16cid:durableId="1265265567">
+    <w:abstractNumId w:val="23"/>
   </w:num>
 </w:numbering>
 </file>

</xml_diff>